<commit_message>
Docs: S12 plan closed; pricing_manager grant/revoke runbooks for customer service; cheatsheet
S12_Implementation_Plan_CLOSED.md (Sprint 12 closeout). Two PROD SQL Editor
runbooks that add / remove the pricing_manager additional role for the
customer service team (set tier + Deviations only, D-PRICE-51) - files only,
nothing applied by this commit. Claude cheatsheet update.

Co-Authored-By: Claude Opus 5.5 <noreply@anthropic.com>
</commit_message>
<xml_diff>
--- a/Docs/SkyNet_Claude_Cheatsheet.docx
+++ b/Docs/SkyNet_Claude_Cheatsheet.docx
@@ -27,7 +27,7 @@
           <w:sz w:val="20"/>
           <w:szCs w:val="20"/>
         </w:rPr>
-        <w:t xml:space="preserve">Matt ⇄ Claude working agreement · v4 · September 23, 2026</w:t>
+        <w:t xml:space="preserve">Matt ⇄ Claude working agreement · v5 · September 30, 2026</w:t>
       </w:r>
     </w:p>
     <w:p>
@@ -227,6 +227,62 @@
           <w:sz w:val="20"/>
           <w:szCs w:val="20"/>
         </w:rPr>
+        <w:t xml:space="preserve">Ask where a module is heading before building into it. </w:t>
+      </w:r>
+      <w:r>
+        <w:rPr>
+          <w:b w:val="false"/>
+          <w:bCs w:val="false"/>
+          <w:sz w:val="20"/>
+          <w:szCs w:val="20"/>
+        </w:rPr>
+        <w:t xml:space="preserve">Batch C put a component picker into Edit CO a day before Matt set Customer Orders on a phase-out; one question (“is this screen staying?”) would have saved the round. When a proposal adds UI to a surface, name the surface’s future in the proposal.</w:t>
+      </w:r>
+    </w:p>
+    <w:p>
+      <w:pPr>
+        <w:pStyle w:val="ListParagraph"/>
+        <w:numPr>
+          <w:ilvl w:val="0"/>
+          <w:numId w:val="2"/>
+        </w:numPr>
+        <w:spacing w:after="60"/>
+      </w:pPr>
+      <w:r>
+        <w:rPr>
+          <w:b/>
+          <w:bCs/>
+          <w:sz w:val="20"/>
+          <w:szCs w:val="20"/>
+        </w:rPr>
+        <w:t xml:space="preserve">Every proposed feature names the decision it serves. </w:t>
+      </w:r>
+      <w:r>
+        <w:rPr>
+          <w:b w:val="false"/>
+          <w:bCs w:val="false"/>
+          <w:sz w:val="20"/>
+          <w:szCs w:val="20"/>
+        </w:rPr>
+        <w:t xml:space="preserve">When Matt asks “what is the purpose of X”, answer plainly — and if the honest answer is thin, say so and drop it (the Order Queue “edit components” button: the list is guidance, the WO’s jobs are the truth). Recommending less is part of the job.</w:t>
+      </w:r>
+    </w:p>
+    <w:p>
+      <w:pPr>
+        <w:pStyle w:val="ListParagraph"/>
+        <w:numPr>
+          <w:ilvl w:val="0"/>
+          <w:numId w:val="2"/>
+        </w:numPr>
+        <w:spacing w:after="60"/>
+      </w:pPr>
+      <w:r>
+        <w:rPr>
+          <w:b/>
+          <w:bCs/>
+          <w:sz w:val="20"/>
+          <w:szCs w:val="20"/>
+        </w:rPr>
         <w:t xml:space="preserve">Own corrections plainly. </w:t>
       </w:r>
       <w:r>
@@ -790,6 +846,34 @@
           <w:sz w:val="20"/>
           <w:szCs w:val="20"/>
         </w:rPr>
+        <w:t xml:space="preserve">A copied identifier is followed, not copied once. </w:t>
+      </w:r>
+      <w:r>
+        <w:rPr>
+          <w:b w:val="false"/>
+          <w:bCs w:val="false"/>
+          <w:sz w:val="20"/>
+          <w:szCs w:val="20"/>
+        </w:rPr>
+        <w:t xml:space="preserve">Before making a SkyNet value equal to a source value (CO line number = Fishbowl line number), check whether the source ever changes it. Fishbowl renumbers lines when one above is deleted; the mirror’s removed-vs-live overlaps showed it before anything shipped.</w:t>
+      </w:r>
+    </w:p>
+    <w:p>
+      <w:pPr>
+        <w:pStyle w:val="ListParagraph"/>
+        <w:numPr>
+          <w:ilvl w:val="0"/>
+          <w:numId w:val="2"/>
+        </w:numPr>
+        <w:spacing w:after="60"/>
+      </w:pPr>
+      <w:r>
+        <w:rPr>
+          <w:b/>
+          <w:bCs/>
+          <w:sz w:val="20"/>
+          <w:szCs w:val="20"/>
+        </w:rPr>
         <w:t xml:space="preserve">Read-only diagnostic first. </w:t>
       </w:r>
       <w:r>
@@ -1059,6 +1143,62 @@
           <w:sz w:val="20"/>
           <w:szCs w:val="20"/>
         </w:rPr>
+        <w:t xml:space="preserve">Large functions are patched in place, never re-typed. </w:t>
+      </w:r>
+      <w:r>
+        <w:rPr>
+          <w:b w:val="false"/>
+          <w:bCs w:val="false"/>
+          <w:sz w:val="20"/>
+          <w:szCs w:val="20"/>
+        </w:rPr>
+        <w:t xml:space="preserve">fb_ingest_delta (23 KB) was changed twice by a DO block that reads pg_get_functiondef, refuses unless the md5 matches the version read that day and a CRLF-exact anchor occurs once, replaces, and EXECUTEs; a marker makes it re-run safe. In the scratch DB the patch is tested on a stand-in function carrying the same anchor. The spec records the current md5 so the next patch can guard on it.</w:t>
+      </w:r>
+    </w:p>
+    <w:p>
+      <w:pPr>
+        <w:pStyle w:val="ListParagraph"/>
+        <w:numPr>
+          <w:ilvl w:val="0"/>
+          <w:numId w:val="2"/>
+        </w:numPr>
+        <w:spacing w:after="60"/>
+      </w:pPr>
+      <w:r>
+        <w:rPr>
+          <w:b/>
+          <w:bCs/>
+          <w:sz w:val="20"/>
+          <w:szCs w:val="20"/>
+        </w:rPr>
+        <w:t xml:space="preserve">Verify in its own statement. </w:t>
+      </w:r>
+      <w:r>
+        <w:rPr>
+          <w:b w:val="false"/>
+          <w:bCs w:val="false"/>
+          <w:sz w:val="20"/>
+          <w:szCs w:val="20"/>
+        </w:rPr>
+        <w:t xml:space="preserve">A VERIFY that runs in the same SELECT as the fix reads the pre-fix snapshot (the D-DATE-04 one-shot “still stale 19” that was already 0). Apply and verify are separate blocks, always.</w:t>
+      </w:r>
+    </w:p>
+    <w:p>
+      <w:pPr>
+        <w:pStyle w:val="ListParagraph"/>
+        <w:numPr>
+          <w:ilvl w:val="0"/>
+          <w:numId w:val="2"/>
+        </w:numPr>
+        <w:spacing w:after="60"/>
+      </w:pPr>
+      <w:r>
+        <w:rPr>
+          <w:b/>
+          <w:bCs/>
+          <w:sz w:val="20"/>
+          <w:szCs w:val="20"/>
+        </w:rPr>
         <w:t xml:space="preserve">DIAG files are the pass/fail. </w:t>
       </w:r>
       <w:r>
@@ -1131,16 +1271,16 @@
           <w:sz w:val="20"/>
           <w:szCs w:val="20"/>
         </w:rPr>
-        <w:t xml:space="preserve">Claude’s tool use is read-only; people apply the writes. </w:t>
-      </w:r>
-      <w:r>
-        <w:rPr>
-          <w:b w:val="false"/>
-          <w:bCs w:val="false"/>
-          <w:sz w:val="20"/>
-          <w:szCs w:val="20"/>
-        </w:rPr>
-        <w:t xml:space="preserve">Org instruction, clarified Sep 23: “Claude’s own tool use against Fishbowl and SkyNet is read-only; drafted migrations and integration code are applied only by a person after TEST.” Claude drafts migrations, RPCs, bridge code and CC prompts; Matt applies SQL and deploys. Reading the rule more strictly than that cost a day.</w:t>
+        <w:t xml:space="preserve">Claude applies TEST; people apply PROD. </w:t>
+      </w:r>
+      <w:r>
+        <w:rPr>
+          <w:b w:val="false"/>
+          <w:bCs w:val="false"/>
+          <w:sz w:val="20"/>
+          <w:szCs w:val="20"/>
+        </w:rPr>
+        <w:t xml:space="preserve">Org instruction, updated for Sprint 12: Claude applies migrations, data corrections and diagnostics to the SkyNet TEST project directly and states what it ran and the result; SkyNet PROD and Fishbowl stay read-only for Claude. Anything for PROD is delivered as a file and run by Matt after it has passed on TEST, with the dry-run output pasted back at each review stop.</w:t>
       </w:r>
     </w:p>
     <w:p>
@@ -1997,6 +2137,34 @@
           <w:szCs w:val="24"/>
         </w:rPr>
         <w:t xml:space="preserve">Stop conditions — halt and report</w:t>
+      </w:r>
+    </w:p>
+    <w:p>
+      <w:pPr>
+        <w:pStyle w:val="ListParagraph"/>
+        <w:numPr>
+          <w:ilvl w:val="0"/>
+          <w:numId w:val="2"/>
+        </w:numPr>
+        <w:spacing w:after="60"/>
+      </w:pPr>
+      <w:r>
+        <w:rPr>
+          <w:b/>
+          <w:bCs/>
+          <w:sz w:val="20"/>
+          <w:szCs w:val="20"/>
+        </w:rPr>
+        <w:t xml:space="preserve">Seed what TEST cannot produce. </w:t>
+      </w:r>
+      <w:r>
+        <w:rPr>
+          <w:b w:val="false"/>
+          <w:bCs w:val="false"/>
+          <w:sz w:val="20"/>
+          <w:szCs w:val="20"/>
+        </w:rPr>
+        <w:t xml:space="preserve">When a review needs a rare event (a Fishbowl exception, a part swap), Claude seeds it on TEST as a labelled TEST_ONLY file (fb_username ‘claude-test-seed’), runs it, and names the seeded ids in the VERIFY. It is filed in Docs/migrations as TEST-only and never runs on PROD.</w:t>
       </w:r>
     </w:p>
     <w:p>

</xml_diff>